<commit_message>
Mailagent: KI-Hinweis unter freigegebenen Mails fest, Tagesübersichten wie Nachrichten, Bankverbindungen 24 Monate (nexai-mailagent b50aa80/5fdebe0)
- Anlage A 5.4 Abs. (6) S. 3 und Abs. (7) b/c; AVV Anhang 3 zwei Zeilen
- Quelle: src/signatur.ts:146 (kiHinweis fest), src/loeschen.ts:103/257/271
- jeweils [setzt voraus: Mailagent-Version ausgerollt] bis zur Rollout-Meldung

Co-Authored-By: Claude Opus 5.5 <noreply@anthropic.com>
</commit_message>
<xml_diff>
--- a/vertrag/03_AnlageA_Leistungsbeschreibung.docx
+++ b/vertrag/03_AnlageA_Leistungsbeschreibung.docx
@@ -2491,7 +2491,7 @@
           <w:sz w:val="21"/>
           <w:szCs w:val="21"/>
         </w:rPr>
-        <w:t xml:space="preserve"> Jede vom Mailagenten erstellte Nachricht trägt eine maschinenlesbare KI-Kennzeichnung im Nachrichtenkopf. Selbsttätig versandte Nachrichten (Absatz (1) Satz 2) tragen zusätzlich einen sichtbaren, nicht abschaltbaren Hinweis auf den Versand ohne menschliche Prüfung. Unter freigegebenen Nachrichten steht ein sichtbarer Hinweis nach Vorgabe von NexAI, den der Kunde anpassen lassen kann.</w:t>
+        <w:t xml:space="preserve"> Jede vom Mailagenten erstellte Nachricht trägt eine maschinenlesbare KI-Kennzeichnung im Nachrichtenkopf. Selbsttätig versandte Nachrichten (Absatz (1) Satz 2) tragen zusätzlich einen sichtbaren, nicht abschaltbaren Hinweis auf den Versand ohne menschliche Prüfung. Unter freigegebenen Nachrichten steht ein sichtbarer, nicht abschaltbarer Hinweis auf die Unterstützung durch KI; den Wortlaut legt NexAI fest [setzt voraus: Mailagent-Version b50aa80 ausgerollt].</w:t>
       </w:r>
     </w:p>
     <w:p>
@@ -2646,7 +2646,7 @@
           <w:sz w:val="21"/>
           <w:szCs w:val="21"/>
         </w:rPr>
-        <w:t xml:space="preserve"> a) Beim Mailagenten ist die Aufbewahrung der gespiegelten Korrespondenz und des Freigabeprotokolls Teil der Leistung; § 14 Abs. (3) Buchst. (a) des Rahmenvertrages gilt nicht. b) Die Aufbewahrungsdauer wird in Ziffer 3.3 des Auftragsformulars je Datenart vereinbart. Ohne Eintrag gelten: Nachrichten mit Einstufung, Kurzfassung, Fristen, Notizen, Zuweisungen und Suchindex 180 Tage ab dem Datum der Nachricht; Anhänge und ihr ausgelesener Text 90 Tage; verworfene Entwürfe 90 Tage; der Wortlaut im Freigabeprotokoll und das Verwaltungsprotokoll 1.095 Tage; die übrigen Angaben einer Zeile des Freigabeprotokolls (Person, Zeitpunkt, Aktion, Prüfsummen) bis zum Ablauf des sechsten vollen Kalenderjahres nach dem Jahr der Freigabe; Tagesübersichten und gespeicherte Bankverbindungen bekannter Absender [Frist von Max festzulegen; setzt voraus: Aufnahme in den Löschlauf, bis dahin keine automatische Löschung]. c) Der Kunde kann die Fristen in der Anwendung ändern; jede Änderung ist eine dokumentierte Weisung (Anlage B § 4 Abs. (5)). Fristen unter sieben Tagen sind ausgeschlossen. Eine Verlängerung über die Vorgabe wird erst wirksam, wenn der Kunde sie in der Anwendung ausdrücklich bestätigt; für die längere Aufbewahrung muss beim Kunden eine Rechtsgrundlage bestehen. Eine Verkürzung wirkt mit dem nächsten Löschlauf; danach gelöschte Daten lassen sich nicht wiederherstellen. d) NexAI setzt die Fristen durch einen täglichen Löschlauf durch [setzt voraus: Löschlauf in der Instanz des Kunden scharf geschaltet]. In Sicherungskopien bleiben gelöschte Daten bis zu deren turnusmäßigem Überschreiben erhalten (Anlage B, Anhang 3). e) Der Mailagent ist kein Archiv zur Erfüllung gesetzlicher Aufbewahrungspflichten, insbesondere nicht nach § 257 HGB und § 147 AO; empfangene und abgesandte Handels- und Geschäftsbriefe bewahrt der Kunde in seinen eigenen Systemen auf, führendes System ist das Postfach des Kunden. Von jeder Antwort, die der Mailagent versendet, liegt eine unveränderte Kopie im Ordner für gesendete Nachrichten des jeweiligen Postfachs [setzt voraus: Ablage im Gesendet-Ordner in der Instanz des Kunden ausgerollt]. f) Nach Beendigung des Vertrags gilt Anlage B § 12 auch für das Freigabeprotokoll und das Verwaltungsprotokoll; die Fristen nach Buchstabe b verlängern die Speicherung bei NexAI nicht über das Vertragsende hinaus.</w:t>
+        <w:t xml:space="preserve"> a) Beim Mailagenten ist die Aufbewahrung der gespiegelten Korrespondenz und des Freigabeprotokolls Teil der Leistung; § 14 Abs. (3) Buchst. (a) des Rahmenvertrages gilt nicht. b) Die Aufbewahrungsdauer wird in Ziffer 3.3 des Auftragsformulars je Datenart vereinbart. Ohne Eintrag gelten: Nachrichten mit Einstufung, Kurzfassung, Fristen, Notizen, Zuweisungen und Suchindex 180 Tage ab dem Datum der Nachricht; Anhänge und ihr ausgelesener Text 90 Tage; verworfene Entwürfe 90 Tage; der Wortlaut im Freigabeprotokoll und das Verwaltungsprotokoll 1.095 Tage; die übrigen Angaben einer Zeile des Freigabeprotokolls (Person, Zeitpunkt, Aktion, Prüfsummen) bis zum Ablauf des sechsten vollen Kalenderjahres nach dem Jahr der Freigabe; Tagesübersichten wie Nachrichten; gespeicherte Bankverbindungen bekannter Absender 24 Monate nach ihrer letzten Nennung [setzt voraus: Mailagent-Version 5fdebe0 ausgerollt]. c) Der Kunde kann die Fristen in der Anwendung ändern, ausgenommen die Frist für gespeicherte Bankverbindungen, die der Betrugserkennung dient; jede Änderung ist eine dokumentierte Weisung (Anlage B § 4 Abs. (5)). Fristen unter sieben Tagen sind ausgeschlossen. Eine Verlängerung über die Vorgabe wird erst wirksam, wenn der Kunde sie in der Anwendung ausdrücklich bestätigt; für die längere Aufbewahrung muss beim Kunden eine Rechtsgrundlage bestehen. Eine Verkürzung wirkt mit dem nächsten Löschlauf; danach gelöschte Daten lassen sich nicht wiederherstellen. d) NexAI setzt die Fristen durch einen täglichen Löschlauf durch [setzt voraus: Löschlauf in der Instanz des Kunden scharf geschaltet]. In Sicherungskopien bleiben gelöschte Daten bis zu deren turnusmäßigem Überschreiben erhalten (Anlage B, Anhang 3). e) Der Mailagent ist kein Archiv zur Erfüllung gesetzlicher Aufbewahrungspflichten, insbesondere nicht nach § 257 HGB und § 147 AO; empfangene und abgesandte Handels- und Geschäftsbriefe bewahrt der Kunde in seinen eigenen Systemen auf, führendes System ist das Postfach des Kunden. Von jeder Antwort, die der Mailagent versendet, liegt eine unveränderte Kopie im Ordner für gesendete Nachrichten des jeweiligen Postfachs [setzt voraus: Ablage im Gesendet-Ordner in der Instanz des Kunden ausgerollt]. f) Nach Beendigung des Vertrags gilt Anlage B § 12 auch für das Freigabeprotokoll und das Verwaltungsprotokoll; die Fristen nach Buchstabe b verlängern die Speicherung bei NexAI nicht über das Vertragsende hinaus.</w:t>
       </w:r>
     </w:p>
     <w:p>

</xml_diff>

<commit_message>
Vertragswerk: Mailagent a95aa12 ausgerollt (19.10. 00:08) — [setzt voraus]-Vermerke zu KI-Hinweis, Tagesübersichten und Bankverbindungen entfernt
Anlage A 5.4 Abs. 6 S. 3 und Abs. 7 b, AVV Anhang 3 (zwei Zeilen), komplett, einfach erklärt.
Code: nexai-mailagent b50aa80 (src/signatur.ts:146-147), 5fdebe0 (src/loeschen.ts:103/257-258/271).
Rollout laut Mailagent-Sitzung (Max, 19.10. 00:08, Health ok); von hier nicht per SSH nachprüfbar.

Co-Authored-By: Claude Opus 5.5 <noreply@anthropic.com>
</commit_message>
<xml_diff>
--- a/vertrag/03_AnlageA_Leistungsbeschreibung.docx
+++ b/vertrag/03_AnlageA_Leistungsbeschreibung.docx
@@ -2491,7 +2491,7 @@
           <w:sz w:val="21"/>
           <w:szCs w:val="21"/>
         </w:rPr>
-        <w:t xml:space="preserve"> Jede vom Mailagenten erstellte Nachricht trägt eine maschinenlesbare KI-Kennzeichnung im Nachrichtenkopf. Selbsttätig versandte Nachrichten (Absatz (1) Satz 2) tragen zusätzlich einen sichtbaren, nicht abschaltbaren Hinweis auf den Versand ohne menschliche Prüfung. Unter freigegebenen Nachrichten steht ein sichtbarer, nicht abschaltbarer Hinweis auf die Unterstützung durch KI; den Wortlaut legt NexAI fest [setzt voraus: Mailagent-Version b50aa80 ausgerollt].</w:t>
+        <w:t xml:space="preserve"> Jede vom Mailagenten erstellte Nachricht trägt eine maschinenlesbare KI-Kennzeichnung im Nachrichtenkopf. Selbsttätig versandte Nachrichten (Absatz (1) Satz 2) tragen zusätzlich einen sichtbaren, nicht abschaltbaren Hinweis auf den Versand ohne menschliche Prüfung. Unter freigegebenen Nachrichten steht ein sichtbarer, nicht abschaltbarer Hinweis auf die Unterstützung durch KI; den Wortlaut legt NexAI fest.</w:t>
       </w:r>
     </w:p>
     <w:p>
@@ -2646,7 +2646,7 @@
           <w:sz w:val="21"/>
           <w:szCs w:val="21"/>
         </w:rPr>
-        <w:t xml:space="preserve"> a) Beim Mailagenten ist die Aufbewahrung der gespiegelten Korrespondenz und des Freigabeprotokolls Teil der Leistung; § 14 Abs. (3) Buchst. (a) des Rahmenvertrages gilt nicht. b) Die Aufbewahrungsdauer wird in Ziffer 3.3 des Auftragsformulars je Datenart vereinbart. Ohne Eintrag gelten: Nachrichten mit Einstufung, Kurzfassung, Fristen, Notizen, Zuweisungen und Suchindex 180 Tage ab dem Datum der Nachricht; Anhänge und ihr ausgelesener Text 90 Tage; verworfene Entwürfe 90 Tage; der Wortlaut im Freigabeprotokoll und das Verwaltungsprotokoll 1.095 Tage; die übrigen Angaben einer Zeile des Freigabeprotokolls (Person, Zeitpunkt, Aktion, Prüfsummen) bis zum Ablauf des sechsten vollen Kalenderjahres nach dem Jahr der Freigabe; Tagesübersichten wie Nachrichten; gespeicherte Bankverbindungen bekannter Absender 24 Monate nach ihrer letzten Nennung [setzt voraus: Mailagent-Version 5fdebe0 ausgerollt]. c) Der Kunde kann die Fristen in der Anwendung ändern, ausgenommen die Frist für gespeicherte Bankverbindungen, die der Betrugserkennung dient; jede Änderung ist eine dokumentierte Weisung (Anlage B § 4 Abs. (5)). Fristen unter sieben Tagen sind ausgeschlossen. Eine Verlängerung über die Vorgabe wird erst wirksam, wenn der Kunde sie in der Anwendung ausdrücklich bestätigt; für die längere Aufbewahrung muss beim Kunden eine Rechtsgrundlage bestehen. Eine Verkürzung wirkt mit dem nächsten Löschlauf; danach gelöschte Daten lassen sich nicht wiederherstellen. d) NexAI setzt die Fristen durch einen täglichen Löschlauf durch [setzt voraus: Löschlauf in der Instanz des Kunden scharf geschaltet]. In Sicherungskopien bleiben gelöschte Daten bis zu deren turnusmäßigem Überschreiben erhalten (Anlage B, Anhang 3). e) Der Mailagent ist kein Archiv zur Erfüllung gesetzlicher Aufbewahrungspflichten, insbesondere nicht nach § 257 HGB und § 147 AO; empfangene und abgesandte Handels- und Geschäftsbriefe bewahrt der Kunde in seinen eigenen Systemen auf, führendes System ist das Postfach des Kunden. Von jeder Antwort, die der Mailagent versendet, liegt eine unveränderte Kopie im Ordner für gesendete Nachrichten des jeweiligen Postfachs [setzt voraus: Ablage im Gesendet-Ordner in der Instanz des Kunden ausgerollt]. f) Nach Beendigung des Vertrags gilt Anlage B § 12 auch für das Freigabeprotokoll und das Verwaltungsprotokoll; die Fristen nach Buchstabe b verlängern die Speicherung bei NexAI nicht über das Vertragsende hinaus.</w:t>
+        <w:t xml:space="preserve"> a) Beim Mailagenten ist die Aufbewahrung der gespiegelten Korrespondenz und des Freigabeprotokolls Teil der Leistung; § 14 Abs. (3) Buchst. (a) des Rahmenvertrages gilt nicht. b) Die Aufbewahrungsdauer wird in Ziffer 3.3 des Auftragsformulars je Datenart vereinbart. Ohne Eintrag gelten: Nachrichten mit Einstufung, Kurzfassung, Fristen, Notizen, Zuweisungen und Suchindex 180 Tage ab dem Datum der Nachricht; Anhänge und ihr ausgelesener Text 90 Tage; verworfene Entwürfe 90 Tage; der Wortlaut im Freigabeprotokoll und das Verwaltungsprotokoll 1.095 Tage; die übrigen Angaben einer Zeile des Freigabeprotokolls (Person, Zeitpunkt, Aktion, Prüfsummen) bis zum Ablauf des sechsten vollen Kalenderjahres nach dem Jahr der Freigabe; Tagesübersichten wie Nachrichten; gespeicherte Bankverbindungen bekannter Absender 24 Monate nach ihrer letzten Nennung. c) Der Kunde kann die Fristen in der Anwendung ändern, ausgenommen die Frist für gespeicherte Bankverbindungen, die der Betrugserkennung dient; jede Änderung ist eine dokumentierte Weisung (Anlage B § 4 Abs. (5)). Fristen unter sieben Tagen sind ausgeschlossen. Eine Verlängerung über die Vorgabe wird erst wirksam, wenn der Kunde sie in der Anwendung ausdrücklich bestätigt; für die längere Aufbewahrung muss beim Kunden eine Rechtsgrundlage bestehen. Eine Verkürzung wirkt mit dem nächsten Löschlauf; danach gelöschte Daten lassen sich nicht wiederherstellen. d) NexAI setzt die Fristen durch einen täglichen Löschlauf durch [setzt voraus: Löschlauf in der Instanz des Kunden scharf geschaltet]. In Sicherungskopien bleiben gelöschte Daten bis zu deren turnusmäßigem Überschreiben erhalten (Anlage B, Anhang 3). e) Der Mailagent ist kein Archiv zur Erfüllung gesetzlicher Aufbewahrungspflichten, insbesondere nicht nach § 257 HGB und § 147 AO; empfangene und abgesandte Handels- und Geschäftsbriefe bewahrt der Kunde in seinen eigenen Systemen auf, führendes System ist das Postfach des Kunden. Von jeder Antwort, die der Mailagent versendet, liegt eine unveränderte Kopie im Ordner für gesendete Nachrichten des jeweiligen Postfachs [setzt voraus: Ablage im Gesendet-Ordner in der Instanz des Kunden ausgerollt]. f) Nach Beendigung des Vertrags gilt Anlage B § 12 auch für das Freigabeprotokoll und das Verwaltungsprotokoll; die Fristen nach Buchstabe b verlängern die Speicherung bei NexAI nicht über das Vertragsende hinaus.</w:t>
       </w:r>
     </w:p>
     <w:p>

</xml_diff>